<commit_message>
Replace IFA with GTC across demo seed data and reset templates
</commit_message>
<xml_diff>
--- a/demo/templates/rtx-spark-campaign-plan.docx
+++ b/demo/templates/rtx-spark-campaign-plan.docx
@@ -149,7 +149,7 @@
           <w:color w:val="1f2937"/>
           <w:rtl w:val="0"/>
         </w:rPr>
-        <w:t xml:space="preserve">Leave the Exec Review with approval on the keynote storyline and alignment on the IFA demo slate.</w:t>
+        <w:t xml:space="preserve">Leave the Exec Review with approval on the keynote storyline and alignment on the GTC demo slate.</w:t>
       </w:r>
     </w:p>
     <w:p>
@@ -367,7 +367,7 @@
           <w:szCs w:val="24"/>
           <w:rtl w:val="0"/>
         </w:rPr>
-        <w:t xml:space="preserve">2. IFA demo slate</w:t>
+        <w:t xml:space="preserve">2. GTC demo slate</w:t>
       </w:r>
     </w:p>
     <w:p>
@@ -573,7 +573,7 @@
           <w:color w:val="1f2937"/>
           <w:rtl w:val="0"/>
         </w:rPr>
-        <w:t xml:space="preserve">Protect slide 10 for the two decisions: keynote storyline and IFA demos.</w:t>
+        <w:t xml:space="preserve">Protect slide 10 for the two decisions: keynote storyline and GTC demos.</w:t>
       </w:r>
     </w:p>
     <w:p>

</xml_diff>

<commit_message>
Update product specifications, reference tracker, and Second Brain demo content
</commit_message>
<xml_diff>
--- a/demo/templates/rtx-spark-campaign-plan.docx
+++ b/demo/templates/rtx-spark-campaign-plan.docx
@@ -169,7 +169,7 @@
           <w:color w:val="1f2937"/>
           <w:rtl w:val="0"/>
         </w:rPr>
-        <w:t xml:space="preserve">Lock one performance claim and disclaimer, then propagate it without drift.</w:t>
+        <w:t xml:space="preserve">Keep the approved product specifications consistent, including “up to” and FP4.</w:t>
       </w:r>
     </w:p>
     <w:p>
@@ -235,7 +235,7 @@
           <w:color w:val="1f2937"/>
           <w:rtl w:val="0"/>
         </w:rPr>
-        <w:t xml:space="preserve">Revised performance wording has arrived, but exact approved figures are not yet captured in the Second Brain.</w:t>
+        <w:t xml:space="preserve">Approved product specifications have arrived, but the deck and campaign copy still need updating.</w:t>
       </w:r>
     </w:p>
     <w:p>
@@ -341,7 +341,7 @@
           <w:color w:val="1f2937"/>
           <w:rtl w:val="0"/>
         </w:rPr>
-        <w:t xml:space="preserve">Approve the agent-first narrative as the spine of the keynote. Product specifications and performance evidence should prove the promise, not compete with it.</w:t>
+        <w:t xml:space="preserve">Approve the agent-first narrative as the spine of the keynote. Use the approved product specifications to support that story.</w:t>
       </w:r>
     </w:p>
     <w:p>
@@ -407,21 +407,21 @@
           <w:szCs w:val="24"/>
           <w:rtl w:val="0"/>
         </w:rPr>
-        <w:t xml:space="preserve">3. Claims and disclaimer</w:t>
-      </w:r>
-    </w:p>
-    <w:p>
-      <w:pPr>
-        <w:rPr>
-          <w:color w:val="1f2937"/>
-        </w:rPr>
-      </w:pPr>
-      <w:r>
-        <w:rPr>
-          <w:color w:val="1f2937"/>
-          <w:rtl w:val="0"/>
-        </w:rPr>
-        <w:t xml:space="preserve">Approve the final wording, comparison, disclaimer placement, and marketing owner for legal intake LGL-2026-0847. Do not invent or extrapolate performance numbers.</w:t>
+        <w:t xml:space="preserve">3. Product specifications</w:t>
+      </w:r>
+    </w:p>
+    <w:p>
+      <w:pPr>
+        <w:rPr>
+          <w:color w:val="1f2937"/>
+        </w:rPr>
+      </w:pPr>
+      <w:r>
+        <w:rPr>
+          <w:color w:val="1f2937"/>
+          <w:rtl w:val="0"/>
+        </w:rPr>
+        <w:t xml:space="preserve">Confirm the specification wording and marketing owner for legal intake LGL-2026-0847. Keep “up to” and FP4 intact. Route final external copy through Legal.</w:t>
       </w:r>
     </w:p>
     <w:p>
@@ -533,7 +533,7 @@
           <w:color w:val="1f2937"/>
           <w:rtl w:val="0"/>
         </w:rPr>
-        <w:t xml:space="preserve">Update slide 4 only after the approved performance figures are captured.</w:t>
+        <w:t xml:space="preserve">Update slide 4 with Mike’s approved product specifications, retaining “up to” and FP4.</w:t>
       </w:r>
     </w:p>
     <w:p>
@@ -619,7 +619,7 @@
           <w:color w:val="1f2937"/>
           <w:rtl w:val="0"/>
         </w:rPr>
-        <w:t xml:space="preserve">Resolve review comments and apply the same approved claim and disclaimer as the deck.</w:t>
+        <w:t xml:space="preserve">Resolve review comments and apply the same approved specification wording as the deck.</w:t>
       </w:r>
     </w:p>
     <w:p>

</xml_diff>